<commit_message>
Updated requirements to replace PySimpleGui with FreeSimpleGui
</commit_message>
<xml_diff>
--- a/Documentation/PET Import Repair from PACS.docx
+++ b/Documentation/PET Import Repair from PACS.docx
@@ -4553,8 +4553,8 @@
 </file>
 
 <file path=customXml/item2.xml><?xml version="1.0" encoding="utf-8"?>
-<ct:contentTypeSchema xmlns:ct="http://schemas.microsoft.com/office/2006/metadata/contentType" xmlns:ma="http://schemas.microsoft.com/office/2006/metadata/properties/metaAttributes" ct:_="" ma:_="" ma:contentTypeName="Document" ma:contentTypeID="0x0101003F5ED4C9C3BCF64FB602E6BC73E05343" ma:contentTypeVersion="12" ma:contentTypeDescription="Create a new document." ma:contentTypeScope="" ma:versionID="397cb7ad8547c459cd7308520d644917">
-  <xsd:schema xmlns:xsd="http://www.w3.org/2001/XMLSchema" xmlns:xs="http://www.w3.org/2001/XMLSchema" xmlns:p="http://schemas.microsoft.com/office/2006/metadata/properties" xmlns:ns2="347c6671-e14e-499f-bdff-5abebf9f2841" xmlns:ns3="ad65eebb-9aa8-49dc-954e-2f274fb67fdf" targetNamespace="http://schemas.microsoft.com/office/2006/metadata/properties" ma:root="true" ma:fieldsID="f75798c7024998a5fc5aa381b0ebefce" ns2:_="" ns3:_="">
+<ct:contentTypeSchema xmlns:ct="http://schemas.microsoft.com/office/2006/metadata/contentType" xmlns:ma="http://schemas.microsoft.com/office/2006/metadata/properties/metaAttributes" ct:_="" ma:_="" ma:contentTypeName="Document" ma:contentTypeID="0x0101003F5ED4C9C3BCF64FB602E6BC73E05343" ma:contentTypeVersion="14" ma:contentTypeDescription="Create a new document." ma:contentTypeScope="" ma:versionID="b589f7e5eeb6bec19614f33cf7f0cf85">
+  <xsd:schema xmlns:xsd="http://www.w3.org/2001/XMLSchema" xmlns:xs="http://www.w3.org/2001/XMLSchema" xmlns:p="http://schemas.microsoft.com/office/2006/metadata/properties" xmlns:ns2="347c6671-e14e-499f-bdff-5abebf9f2841" xmlns:ns3="ad65eebb-9aa8-49dc-954e-2f274fb67fdf" targetNamespace="http://schemas.microsoft.com/office/2006/metadata/properties" ma:root="true" ma:fieldsID="7942d335befb87718259710f93a11325" ns2:_="" ns3:_="">
     <xsd:import namespace="347c6671-e14e-499f-bdff-5abebf9f2841"/>
     <xsd:import namespace="ad65eebb-9aa8-49dc-954e-2f274fb67fdf"/>
     <xsd:element name="properties">
@@ -4574,6 +4574,8 @@
                 <xsd:element ref="ns3:SharedWithDetails" minOccurs="0"/>
                 <xsd:element ref="ns2:MediaServiceObjectDetectorVersions" minOccurs="0"/>
                 <xsd:element ref="ns2:MediaServiceDateTaken" minOccurs="0"/>
+                <xsd:element ref="ns2:MediaLengthInSeconds" minOccurs="0"/>
+                <xsd:element ref="ns2:MediaServiceSearchProperties" minOccurs="0"/>
               </xsd:all>
             </xsd:complexType>
           </xsd:element>
@@ -4626,6 +4628,16 @@
     <xsd:element name="MediaServiceDateTaken" ma:index="19" nillable="true" ma:displayName="MediaServiceDateTaken" ma:hidden="true" ma:indexed="true" ma:internalName="MediaServiceDateTaken" ma:readOnly="true">
       <xsd:simpleType>
         <xsd:restriction base="dms:Text"/>
+      </xsd:simpleType>
+    </xsd:element>
+    <xsd:element name="MediaLengthInSeconds" ma:index="20" nillable="true" ma:displayName="MediaLengthInSeconds" ma:hidden="true" ma:internalName="MediaLengthInSeconds" ma:readOnly="true">
+      <xsd:simpleType>
+        <xsd:restriction base="dms:Unknown"/>
+      </xsd:simpleType>
+    </xsd:element>
+    <xsd:element name="MediaServiceSearchProperties" ma:index="21" nillable="true" ma:displayName="MediaServiceSearchProperties" ma:hidden="true" ma:internalName="MediaServiceSearchProperties" ma:readOnly="true">
+      <xsd:simpleType>
+        <xsd:restriction base="dms:Note"/>
       </xsd:simpleType>
     </xsd:element>
   </xsd:schema>
@@ -4769,6 +4781,17 @@
 </ct:contentTypeSchema>
 </file>
 
+<file path=customXml/item3.xml><?xml version="1.0" encoding="utf-8"?>
+<p:properties xmlns:p="http://schemas.microsoft.com/office/2006/metadata/properties" xmlns:xsi="http://www.w3.org/2001/XMLSchema-instance" xmlns:pc="http://schemas.microsoft.com/office/infopath/2007/PartnerControls">
+  <documentManagement>
+    <TaxCatchAll xmlns="ad65eebb-9aa8-49dc-954e-2f274fb67fdf" xsi:nil="true"/>
+    <lcf76f155ced4ddcb4097134ff3c332f xmlns="347c6671-e14e-499f-bdff-5abebf9f2841">
+      <Terms xmlns="http://schemas.microsoft.com/office/infopath/2007/PartnerControls"/>
+    </lcf76f155ced4ddcb4097134ff3c332f>
+  </documentManagement>
+</p:properties>
+</file>
+
 <file path=customXml/itemProps1.xml><?xml version="1.0" encoding="utf-8"?>
 <ds:datastoreItem xmlns:ds="http://schemas.openxmlformats.org/officeDocument/2006/customXml" ds:itemID="{EB1B1D3E-5CB8-488B-96EB-3084C740A96E}">
   <ds:schemaRefs>
@@ -4778,20 +4801,9 @@
 </file>
 
 <file path=customXml/itemProps2.xml><?xml version="1.0" encoding="utf-8"?>
-<ds:datastoreItem xmlns:ds="http://schemas.openxmlformats.org/officeDocument/2006/customXml" ds:itemID="{442020A8-0A02-4290-8E54-11269B26A23E}">
-  <ds:schemaRefs>
-    <ds:schemaRef ds:uri="http://schemas.microsoft.com/office/2006/metadata/contentType"/>
-    <ds:schemaRef ds:uri="http://schemas.microsoft.com/office/2006/metadata/properties/metaAttributes"/>
-    <ds:schemaRef ds:uri="http://www.w3.org/2001/XMLSchema"/>
-    <ds:schemaRef ds:uri="http://schemas.microsoft.com/office/2006/metadata/properties"/>
-    <ds:schemaRef ds:uri="347c6671-e14e-499f-bdff-5abebf9f2841"/>
-    <ds:schemaRef ds:uri="ad65eebb-9aa8-49dc-954e-2f274fb67fdf"/>
-    <ds:schemaRef ds:uri="http://schemas.microsoft.com/office/2006/documentManagement/types"/>
-    <ds:schemaRef ds:uri="http://schemas.microsoft.com/office/infopath/2007/PartnerControls"/>
-    <ds:schemaRef ds:uri="http://schemas.openxmlformats.org/package/2006/metadata/core-properties"/>
-    <ds:schemaRef ds:uri="http://purl.org/dc/elements/1.1/"/>
-    <ds:schemaRef ds:uri="http://purl.org/dc/terms/"/>
-    <ds:schemaRef ds:uri="http://schemas.microsoft.com/internal/obd"/>
-  </ds:schemaRefs>
-</ds:datastoreItem>
+<ds:datastoreItem xmlns:ds="http://schemas.openxmlformats.org/officeDocument/2006/customXml" ds:itemID="{3C8F6C3B-4543-4FB5-9C4F-C1B9E8DD0DB8}"/>
+</file>
+
+<file path=customXml/itemProps3.xml><?xml version="1.0" encoding="utf-8"?>
+<ds:datastoreItem xmlns:ds="http://schemas.openxmlformats.org/officeDocument/2006/customXml" ds:itemID="{28B8F42E-E50A-4C26-902A-7E68FA469586}"/>
 </file>
</xml_diff>